<commit_message>
feat(evidence): measure all 14 attack families; guided demo, hardening lab, judges guide
- family coverage now measures every executable family (in-training and
  leave-one-family-out zero-day) with layer attribution: mean recall 0.909
  in-training vs 0.841 withheld; taxonomy, README and the walkthrough
  builder reconciled to 14-of-22
- walkthrough builder fixed to render the coverage, fidelity and latency
  tables from the real artifact schemas; docx regenerated from current
  artifacts (scissor, economics, latency, per-family table)
- dashboard: GUIDED DEMO whose narration advances only on real events,
  artifact-sourced hero badges; /evidence gains the Hardening Lab panel
- add docs/JUDGES.md (five-minute evaluator path), MIT LICENSE, GitHub
  Actions CI; regenerate artifacts/* with provenance stamps
</commit_message>
<xml_diff>
--- a/docs/Solution_Walkthrough_Adversarial_Payment_Arena.docx
+++ b/docs/Solution_Walkthrough_Adversarial_Payment_Arena.docx
@@ -351,7 +351,7 @@
           <w:color w:val="5A6373"/>
           <w:sz w:val="18"/>
         </w:rPr>
-        <w:t>git cd9add9 | generated 2026-08-29 18:48 UTC | seeds and commands are stamped inside every artifact.</w:t>
+        <w:t>git 52061f0 | generated 2026-08-30 12:02 UTC | seeds and commands are stamped inside every artifact.</w:t>
       </w:r>
     </w:p>
     <w:p>
@@ -432,7 +432,7 @@
           <w:color w:val="B32D2D"/>
           <w:sz w:val="21"/>
         </w:rPr>
-        <w:t>+85.0 pts</w:t>
+        <w:t>+85.7 pts</w:t>
       </w:r>
       <w:r>
         <w:rPr>
@@ -450,7 +450,7 @@
           <w:color w:val="B32D2D"/>
           <w:sz w:val="21"/>
         </w:rPr>
-        <w:t>-15.2 pts</w:t>
+        <w:t>-35.8 pts</w:t>
       </w:r>
       <w:r>
         <w:rPr>
@@ -491,7 +491,7 @@
           <w:color w:val="1B7F4B"/>
           <w:sz w:val="21"/>
         </w:rPr>
-        <w:t>-0.3 pts</w:t>
+        <w:t>-0.5 pts</w:t>
       </w:r>
       <w:r>
         <w:rPr>
@@ -509,7 +509,7 @@
           <w:color w:val="1B7F4B"/>
           <w:sz w:val="21"/>
         </w:rPr>
-        <w:t>+14.8 pts</w:t>
+        <w:t>+35.3 pts</w:t>
       </w:r>
       <w:r>
         <w:rPr>
@@ -528,7 +528,7 @@
       <w:r>
         <w:drawing>
           <wp:inline xmlns:a="http://schemas.openxmlformats.org/drawingml/2006/main" xmlns:pic="http://schemas.openxmlformats.org/drawingml/2006/picture">
-            <wp:extent cx="5760720" cy="1837576"/>
+            <wp:extent cx="5760720" cy="1839609"/>
             <wp:docPr id="1" name="Picture 1"/>
             <wp:cNvGraphicFramePr>
               <a:graphicFrameLocks noChangeAspect="1"/>
@@ -549,7 +549,7 @@
                   <pic:spPr>
                     <a:xfrm>
                       <a:off x="0" y="0"/>
-                      <a:ext cx="5760720" cy="1837576"/>
+                      <a:ext cx="5760720" cy="1839609"/>
                     </a:xfrm>
                     <a:prstGeom prst="rect"/>
                   </pic:spPr>
@@ -908,7 +908,7 @@
                 <w:color w:val="1A1F2B"/>
                 <w:sz w:val="17"/>
               </w:rPr>
-              <w:t>22-scenario taxonomy across 5 attack surfaces; 8 executable, each defeating a different control class</w:t>
+              <w:t>22-scenario taxonomy across 5 attack surfaces; 14 executable, each individually measured and each defeating a different control class</w:t>
             </w:r>
           </w:p>
         </w:tc>
@@ -1211,7 +1211,7 @@
           <w:color w:val="1A1F2B"/>
           <w:sz w:val="21"/>
         </w:rPr>
-        <w:t>8 of the 22 are executable today</w:t>
+        <w:t>14 of the 22 are executable today</w:t>
       </w:r>
       <w:r>
         <w:rPr>
@@ -1220,7 +1220,7 @@
           <w:color w:val="1A1F2B"/>
           <w:sz w:val="21"/>
         </w:rPr>
-        <w:t>. We report that ratio rather than claiming 22 implemented attacks. The remaining 14 rows each already name their fields and their target signal, which is why adding one is an afternoon rather than a research project.</w:t>
+        <w:t>. We report that ratio rather than claiming 22 implemented attacks. The remaining 8 rows each already name their fields and their target signal, which is why adding one is an afternoon rather than a research project.</w:t>
       </w:r>
     </w:p>
     <w:p>
@@ -1234,7 +1234,7 @@
           <w:color w:val="1A1F2B"/>
           <w:sz w:val="21"/>
         </w:rPr>
-        <w:t>The four families added most recently were chosen so that coverage breadth is not eight variations of velocity abuse. Each defeats a structurally different control:</w:t>
+        <w:t>The six families added most recently extend breadth beyond velocity abuse and beyond the issuing side. Each defeats a structurally different control:</w:t>
       </w:r>
     </w:p>
     <w:tbl>
@@ -1272,7 +1272,7 @@
         </w:tc>
         <w:tc>
           <w:tcPr>
-            <w:tcW w:type="dxa" w:w="3096"/>
+            <w:tcW w:type="dxa" w:w="2160"/>
             <w:shd w:val="clear" w:fill="1A1F2B"/>
           </w:tcPr>
           <w:p>
@@ -1286,13 +1286,13 @@
                 <w:color w:val="FFFFFF"/>
                 <w:sz w:val="17"/>
               </w:rPr>
-              <w:t>India relevance</w:t>
+              <w:t>Surface</w:t>
             </w:r>
           </w:p>
         </w:tc>
         <w:tc>
           <w:tcPr>
-            <w:tcW w:type="dxa" w:w="3744"/>
+            <w:tcW w:type="dxa" w:w="4680"/>
             <w:shd w:val="clear" w:fill="1A1F2B"/>
           </w:tcPr>
           <w:p>
@@ -1327,13 +1327,13 @@
                 <w:color w:val="1A1F2B"/>
                 <w:sz w:val="17"/>
               </w:rPr>
-              <w:t>T-12 AI-personalised APP scam</w:t>
+              <w:t>T-05 OTP-relay vishing</w:t>
             </w:r>
           </w:p>
         </w:tc>
         <w:tc>
           <w:tcPr>
-            <w:tcW w:type="dxa" w:w="3096"/>
+            <w:tcW w:type="dxa" w:w="2160"/>
           </w:tcPr>
           <w:p>
             <w:pPr>
@@ -1345,13 +1345,13 @@
                 <w:color w:val="1A1F2B"/>
                 <w:sz w:val="17"/>
               </w:rPr>
-              <w:t>UPI push-payment scams; the dominant complaint category on real-time rails</w:t>
+              <w:t>Authentication challenges</w:t>
             </w:r>
           </w:p>
         </w:tc>
         <w:tc>
           <w:tcPr>
-            <w:tcW w:type="dxa" w:w="3744"/>
+            <w:tcW w:type="dxa" w:w="4680"/>
           </w:tcPr>
           <w:p>
             <w:pPr>
@@ -1363,7 +1363,7 @@
                 <w:color w:val="1A1F2B"/>
                 <w:sz w:val="17"/>
               </w:rPr>
-              <w:t>Everything premised on a STOLEN credential. The victim's own device, own account, and a passed 3DS challenge.</w:t>
+              <w:t>Treating a passed 3DS challenge as proof of cardholder presence -- the pass is legitimate, the device is not.</w:t>
             </w:r>
           </w:p>
         </w:tc>
@@ -1384,13 +1384,13 @@
                 <w:color w:val="1A1F2B"/>
                 <w:sz w:val="17"/>
               </w:rPr>
-              <w:t>T-14 VPA-rental mule (fan-in)</w:t>
+              <w:t>T-06 3DS exemption-band abuse</w:t>
             </w:r>
           </w:p>
         </w:tc>
         <w:tc>
           <w:tcPr>
-            <w:tcW w:type="dxa" w:w="3096"/>
+            <w:tcW w:type="dxa" w:w="2160"/>
           </w:tcPr>
           <w:p>
             <w:pPr>
@@ -1402,13 +1402,13 @@
                 <w:color w:val="1A1F2B"/>
                 <w:sz w:val="17"/>
               </w:rPr>
-              <w:t>Rented VPAs are the standard cash-out layer for scam proceeds</w:t>
+              <w:t>Issuer RBA policy</w:t>
             </w:r>
           </w:p>
         </w:tc>
         <w:tc>
           <w:tcPr>
-            <w:tcW w:type="dxa" w:w="3744"/>
+            <w:tcW w:type="dxa" w:w="4680"/>
           </w:tcPr>
           <w:p>
             <w:pPr>
@@ -1420,7 +1420,7 @@
                 <w:color w:val="1A1F2B"/>
                 <w:sz w:val="17"/>
               </w:rPr>
-              <w:t>Per-account monitoring. No single node crosses a threshold; only beneficiary convergence is visible.</w:t>
+              <w:t>Frictionless-exemption logic and velocity counters: every transaction is individually unremarkable by design.</w:t>
             </w:r>
           </w:p>
         </w:tc>
@@ -1441,13 +1441,13 @@
                 <w:color w:val="1A1F2B"/>
                 <w:sz w:val="17"/>
               </w:rPr>
-              <w:t>T-17 Synchronised burst cash-out</w:t>
+              <w:t>T-19 Delegated-agent scope expansion</w:t>
             </w:r>
           </w:p>
         </w:tc>
         <w:tc>
           <w:tcPr>
-            <w:tcW w:type="dxa" w:w="3096"/>
+            <w:tcW w:type="dxa" w:w="2160"/>
           </w:tcPr>
           <w:p>
             <w:pPr>
@@ -1459,13 +1459,13 @@
                 <w:color w:val="1A1F2B"/>
                 <w:sz w:val="17"/>
               </w:rPr>
-              <w:t>Coordinated mule waves inside one detection window</w:t>
+              <w:t>Agentic commerce</w:t>
             </w:r>
           </w:p>
         </w:tc>
         <w:tc>
           <w:tcPr>
-            <w:tcW w:type="dxa" w:w="3744"/>
+            <w:tcW w:type="dxa" w:w="4680"/>
           </w:tcPr>
           <w:p>
             <w:pPr>
@@ -1477,7 +1477,7 @@
                 <w:color w:val="1A1F2B"/>
                 <w:sz w:val="17"/>
               </w:rPr>
-              <w:t>The independence assumption between accounts. Nothing is shared but time.</w:t>
+              <w:t>Device binding and one-time delegation consent -- the device stays trusted while the mandate drifts.</w:t>
             </w:r>
           </w:p>
         </w:tc>
@@ -1498,13 +1498,13 @@
                 <w:color w:val="1A1F2B"/>
                 <w:sz w:val="17"/>
               </w:rPr>
-              <w:t>T-09 Learned threshold structuring</w:t>
+              <w:t>T-11 Geo-velocity with generated itinerary</w:t>
             </w:r>
           </w:p>
         </w:tc>
         <w:tc>
           <w:tcPr>
-            <w:tcW w:type="dxa" w:w="3096"/>
+            <w:tcW w:type="dxa" w:w="2160"/>
           </w:tcPr>
           <w:p>
             <w:pPr>
@@ -1516,13 +1516,13 @@
                 <w:color w:val="1A1F2B"/>
                 <w:sz w:val="17"/>
               </w:rPr>
-              <w:t>Adaptive probing of per-issuer review limits</w:t>
+              <w:t>Travel rules</w:t>
             </w:r>
           </w:p>
         </w:tc>
         <w:tc>
           <w:tcPr>
-            <w:tcW w:type="dxa" w:w="3744"/>
+            <w:tcW w:type="dxa" w:w="4680"/>
           </w:tcPr>
           <w:p>
             <w:pPr>
@@ -1534,7 +1534,121 @@
                 <w:color w:val="1A1F2B"/>
                 <w:sz w:val="17"/>
               </w:rPr>
-              <w:t>Static amount thresholds, including round-number heuristics.</w:t>
+              <w:t>Impossible-travel rules that only compare adjacent pairs; each hop is individually feasible.</w:t>
+            </w:r>
+          </w:p>
+        </w:tc>
+      </w:tr>
+      <w:tr>
+        <w:tc>
+          <w:tcPr>
+            <w:tcW w:type="dxa" w:w="2232"/>
+          </w:tcPr>
+          <w:p>
+            <w:pPr>
+              <w:spacing w:after="20"/>
+            </w:pPr>
+            <w:r/>
+            <w:r>
+              <w:rPr>
+                <w:b/>
+                <w:color w:val="1A1F2B"/>
+                <w:sz w:val="17"/>
+              </w:rPr>
+              <w:t>T-04 Merchant shell bust-out</w:t>
+            </w:r>
+          </w:p>
+        </w:tc>
+        <w:tc>
+          <w:tcPr>
+            <w:tcW w:type="dxa" w:w="2160"/>
+          </w:tcPr>
+          <w:p>
+            <w:pPr>
+              <w:spacing w:after="20"/>
+            </w:pPr>
+            <w:r/>
+            <w:r>
+              <w:rPr>
+                <w:color w:val="1A1F2B"/>
+                <w:sz w:val="17"/>
+              </w:rPr>
+              <w:t>Acquiring side</w:t>
+            </w:r>
+          </w:p>
+        </w:tc>
+        <w:tc>
+          <w:tcPr>
+            <w:tcW w:type="dxa" w:w="4680"/>
+          </w:tcPr>
+          <w:p>
+            <w:pPr>
+              <w:spacing w:after="20"/>
+            </w:pPr>
+            <w:r/>
+            <w:r>
+              <w:rPr>
+                <w:color w:val="1A1F2B"/>
+                <w:sz w:val="17"/>
+              </w:rPr>
+              <w:t>Merchant onboarding document review; the detection signal is merchant-centric, not card-centric.</w:t>
+            </w:r>
+          </w:p>
+        </w:tc>
+      </w:tr>
+      <w:tr>
+        <w:tc>
+          <w:tcPr>
+            <w:tcW w:type="dxa" w:w="2232"/>
+          </w:tcPr>
+          <w:p>
+            <w:pPr>
+              <w:spacing w:after="20"/>
+            </w:pPr>
+            <w:r/>
+            <w:r>
+              <w:rPr>
+                <w:b/>
+                <w:color w:val="1A1F2B"/>
+                <w:sz w:val="17"/>
+              </w:rPr>
+              <w:t>T-20 Decision-boundary probing</w:t>
+            </w:r>
+          </w:p>
+        </w:tc>
+        <w:tc>
+          <w:tcPr>
+            <w:tcW w:type="dxa" w:w="2160"/>
+          </w:tcPr>
+          <w:p>
+            <w:pPr>
+              <w:spacing w:after="20"/>
+            </w:pPr>
+            <w:r/>
+            <w:r>
+              <w:rPr>
+                <w:color w:val="1A1F2B"/>
+                <w:sz w:val="17"/>
+              </w:rPr>
+              <w:t>Model layer</w:t>
+            </w:r>
+          </w:p>
+        </w:tc>
+        <w:tc>
+          <w:tcPr>
+            <w:tcW w:type="dxa" w:w="4680"/>
+          </w:tcPr>
+          <w:p>
+            <w:pPr>
+              <w:spacing w:after="20"/>
+            </w:pPr>
+            <w:r/>
+            <w:r>
+              <w:rPr>
+                <w:color w:val="1A1F2B"/>
+                <w:sz w:val="17"/>
+              </w:rPr>
+              <w:t>The deployed scorer itself, treated as an oracle to map and then stay just inside.</w:t>
             </w:r>
           </w:p>
         </w:tc>
@@ -1583,17 +1697,16 @@
     </w:p>
     <w:p>
       <w:pPr>
+        <w:pStyle w:val="Heading2"/>
+      </w:pPr>
+      <w:r>
+        <w:t>Per-family detection, measured</w:t>
+      </w:r>
+    </w:p>
+    <w:p>
+      <w:pPr>
         <w:spacing w:after="120"/>
       </w:pPr>
-      <w:r>
-        <w:rPr>
-          <w:b/>
-          <w:i w:val="0"/>
-          <w:color w:val="B32D2D"/>
-          <w:sz w:val="21"/>
-        </w:rPr>
-        <w:t xml:space="preserve">Not available. </w:t>
-      </w:r>
       <w:r>
         <w:rPr>
           <w:b w:val="0"/>
@@ -1601,26 +1714,1225 @@
           <w:color w:val="1A1F2B"/>
           <w:sz w:val="21"/>
         </w:rPr>
-        <w:t xml:space="preserve">`artifacts/family_coverage.json` has not been generated. Reproduce with: </w:t>
+        <w:t>Across all 14 executable families: mean recall 0.909 when the family is in training vs 0.841 when it is withheld from supervised training entirely (zero-day), at a pinned 1% legitimate FPR.</w:t>
       </w:r>
-      <w:r>
-        <w:rPr>
-          <w:rFonts w:ascii="Consolas" w:hAnsi="Consolas"/>
-          <w:b w:val="0"/>
-          <w:i w:val="0"/>
-          <w:color w:val="1A1F2B"/>
-          <w:sz w:val="20"/>
-        </w:rPr>
-        <w:t>make coverage</w:t>
-      </w:r>
+    </w:p>
+    <w:tbl>
+      <w:tblPr>
+        <w:tblStyle w:val="TableGrid"/>
+        <w:tblW w:type="auto" w:w="0"/>
+        <w:jc w:val="center"/>
+        <w:tblLook w:firstColumn="1" w:firstRow="1" w:lastColumn="0" w:lastRow="0" w:noHBand="0" w:noVBand="1" w:val="04A0"/>
+      </w:tblPr>
+      <w:tblGrid>
+        <w:gridCol w:w="2448"/>
+        <w:gridCol w:w="2448"/>
+        <w:gridCol w:w="2448"/>
+        <w:gridCol w:w="2448"/>
+      </w:tblGrid>
+      <w:tr>
+        <w:tc>
+          <w:tcPr>
+            <w:tcW w:type="dxa" w:w="2880"/>
+            <w:shd w:val="clear" w:fill="1A1F2B"/>
+          </w:tcPr>
+          <w:p>
+            <w:pPr>
+              <w:spacing w:after="20"/>
+            </w:pPr>
+            <w:r/>
+            <w:r>
+              <w:rPr>
+                <w:b/>
+                <w:color w:val="FFFFFF"/>
+                <w:sz w:val="17"/>
+              </w:rPr>
+              <w:t>Family</w:t>
+            </w:r>
+          </w:p>
+        </w:tc>
+        <w:tc>
+          <w:tcPr>
+            <w:tcW w:type="dxa" w:w="1584"/>
+            <w:shd w:val="clear" w:fill="1A1F2B"/>
+          </w:tcPr>
+          <w:p>
+            <w:pPr>
+              <w:spacing w:after="20"/>
+            </w:pPr>
+            <w:r/>
+            <w:r>
+              <w:rPr>
+                <w:b/>
+                <w:color w:val="FFFFFF"/>
+                <w:sz w:val="17"/>
+              </w:rPr>
+              <w:t>Recall (trained)</w:t>
+            </w:r>
+          </w:p>
+        </w:tc>
+        <w:tc>
+          <w:tcPr>
+            <w:tcW w:type="dxa" w:w="1656"/>
+            <w:shd w:val="clear" w:fill="1A1F2B"/>
+          </w:tcPr>
+          <w:p>
+            <w:pPr>
+              <w:spacing w:after="20"/>
+            </w:pPr>
+            <w:r/>
+            <w:r>
+              <w:rPr>
+                <w:b/>
+                <w:color w:val="FFFFFF"/>
+                <w:sz w:val="17"/>
+              </w:rPr>
+              <w:t>Recall (zero-day)</w:t>
+            </w:r>
+          </w:p>
+        </w:tc>
+        <w:tc>
+          <w:tcPr>
+            <w:tcW w:type="dxa" w:w="2952"/>
+            <w:shd w:val="clear" w:fill="1A1F2B"/>
+          </w:tcPr>
+          <w:p>
+            <w:pPr>
+              <w:spacing w:after="20"/>
+            </w:pPr>
+            <w:r/>
+            <w:r>
+              <w:rPr>
+                <w:b/>
+                <w:color w:val="FFFFFF"/>
+                <w:sz w:val="17"/>
+              </w:rPr>
+              <w:t>Layer(s) firing (zero-day)</w:t>
+            </w:r>
+          </w:p>
+        </w:tc>
+      </w:tr>
+      <w:tr>
+        <w:tc>
+          <w:tcPr>
+            <w:tcW w:type="dxa" w:w="2880"/>
+          </w:tcPr>
+          <w:p>
+            <w:pPr>
+              <w:spacing w:after="20"/>
+            </w:pPr>
+            <w:r/>
+            <w:r>
+              <w:rPr>
+                <w:b/>
+                <w:color w:val="1A1F2B"/>
+                <w:sz w:val="17"/>
+              </w:rPr>
+              <w:t>T-03 voice-clone ATO</w:t>
+            </w:r>
+          </w:p>
+        </w:tc>
+        <w:tc>
+          <w:tcPr>
+            <w:tcW w:type="dxa" w:w="1584"/>
+          </w:tcPr>
+          <w:p>
+            <w:pPr>
+              <w:spacing w:after="20"/>
+            </w:pPr>
+            <w:r/>
+            <w:r>
+              <w:rPr>
+                <w:color w:val="1A1F2B"/>
+                <w:sz w:val="17"/>
+              </w:rPr>
+              <w:t>0.963</w:t>
+            </w:r>
+          </w:p>
+        </w:tc>
+        <w:tc>
+          <w:tcPr>
+            <w:tcW w:type="dxa" w:w="1656"/>
+          </w:tcPr>
+          <w:p>
+            <w:pPr>
+              <w:spacing w:after="20"/>
+            </w:pPr>
+            <w:r/>
+            <w:r>
+              <w:rPr>
+                <w:color w:val="1A1F2B"/>
+                <w:sz w:val="17"/>
+              </w:rPr>
+              <w:t>0.963</w:t>
+            </w:r>
+          </w:p>
+        </w:tc>
+        <w:tc>
+          <w:tcPr>
+            <w:tcW w:type="dxa" w:w="2952"/>
+          </w:tcPr>
+          <w:p>
+            <w:pPr>
+              <w:spacing w:after="20"/>
+            </w:pPr>
+            <w:r/>
+            <w:r>
+              <w:rPr>
+                <w:color w:val="1A1F2B"/>
+                <w:sz w:val="17"/>
+              </w:rPr>
+              <w:t>graph topology, supervised xgb, unsupervised iforest</w:t>
+            </w:r>
+          </w:p>
+        </w:tc>
+      </w:tr>
+      <w:tr>
+        <w:tc>
+          <w:tcPr>
+            <w:tcW w:type="dxa" w:w="2880"/>
+          </w:tcPr>
+          <w:p>
+            <w:pPr>
+              <w:spacing w:after="20"/>
+            </w:pPr>
+            <w:r/>
+            <w:r>
+              <w:rPr>
+                <w:b/>
+                <w:color w:val="1A1F2B"/>
+                <w:sz w:val="17"/>
+              </w:rPr>
+              <w:t>T-01 synthetic mule ring</w:t>
+            </w:r>
+          </w:p>
+        </w:tc>
+        <w:tc>
+          <w:tcPr>
+            <w:tcW w:type="dxa" w:w="1584"/>
+          </w:tcPr>
+          <w:p>
+            <w:pPr>
+              <w:spacing w:after="20"/>
+            </w:pPr>
+            <w:r/>
+            <w:r>
+              <w:rPr>
+                <w:color w:val="1A1F2B"/>
+                <w:sz w:val="17"/>
+              </w:rPr>
+              <w:t>0.926</w:t>
+            </w:r>
+          </w:p>
+        </w:tc>
+        <w:tc>
+          <w:tcPr>
+            <w:tcW w:type="dxa" w:w="1656"/>
+          </w:tcPr>
+          <w:p>
+            <w:pPr>
+              <w:spacing w:after="20"/>
+            </w:pPr>
+            <w:r/>
+            <w:r>
+              <w:rPr>
+                <w:color w:val="1A1F2B"/>
+                <w:sz w:val="17"/>
+              </w:rPr>
+              <w:t>0.881</w:t>
+            </w:r>
+          </w:p>
+        </w:tc>
+        <w:tc>
+          <w:tcPr>
+            <w:tcW w:type="dxa" w:w="2952"/>
+          </w:tcPr>
+          <w:p>
+            <w:pPr>
+              <w:spacing w:after="20"/>
+            </w:pPr>
+            <w:r/>
+            <w:r>
+              <w:rPr>
+                <w:color w:val="1A1F2B"/>
+                <w:sz w:val="17"/>
+              </w:rPr>
+              <w:t>graph topology, supervised xgb, unsupervised iforest</w:t>
+            </w:r>
+          </w:p>
+        </w:tc>
+      </w:tr>
+      <w:tr>
+        <w:tc>
+          <w:tcPr>
+            <w:tcW w:type="dxa" w:w="2880"/>
+          </w:tcPr>
+          <w:p>
+            <w:pPr>
+              <w:spacing w:after="20"/>
+            </w:pPr>
+            <w:r/>
+            <w:r>
+              <w:rPr>
+                <w:b/>
+                <w:color w:val="1A1F2B"/>
+                <w:sz w:val="17"/>
+              </w:rPr>
+              <w:t>T-18 merchant compromise</w:t>
+            </w:r>
+          </w:p>
+        </w:tc>
+        <w:tc>
+          <w:tcPr>
+            <w:tcW w:type="dxa" w:w="1584"/>
+          </w:tcPr>
+          <w:p>
+            <w:pPr>
+              <w:spacing w:after="20"/>
+            </w:pPr>
+            <w:r/>
+            <w:r>
+              <w:rPr>
+                <w:color w:val="1A1F2B"/>
+                <w:sz w:val="17"/>
+              </w:rPr>
+              <w:t>0.985</w:t>
+            </w:r>
+          </w:p>
+        </w:tc>
+        <w:tc>
+          <w:tcPr>
+            <w:tcW w:type="dxa" w:w="1656"/>
+          </w:tcPr>
+          <w:p>
+            <w:pPr>
+              <w:spacing w:after="20"/>
+            </w:pPr>
+            <w:r/>
+            <w:r>
+              <w:rPr>
+                <w:color w:val="1A1F2B"/>
+                <w:sz w:val="17"/>
+              </w:rPr>
+              <w:t>0.733</w:t>
+            </w:r>
+          </w:p>
+        </w:tc>
+        <w:tc>
+          <w:tcPr>
+            <w:tcW w:type="dxa" w:w="2952"/>
+          </w:tcPr>
+          <w:p>
+            <w:pPr>
+              <w:spacing w:after="20"/>
+            </w:pPr>
+            <w:r/>
+            <w:r>
+              <w:rPr>
+                <w:color w:val="1A1F2B"/>
+                <w:sz w:val="17"/>
+              </w:rPr>
+              <w:t>graph topology, supervised xgb, unsupervised iforest</w:t>
+            </w:r>
+          </w:p>
+        </w:tc>
+      </w:tr>
+      <w:tr>
+        <w:tc>
+          <w:tcPr>
+            <w:tcW w:type="dxa" w:w="2880"/>
+          </w:tcPr>
+          <w:p>
+            <w:pPr>
+              <w:spacing w:after="20"/>
+            </w:pPr>
+            <w:r/>
+            <w:r>
+              <w:rPr>
+                <w:b/>
+                <w:color w:val="1A1F2B"/>
+                <w:sz w:val="17"/>
+              </w:rPr>
+              <w:t>T-08 CNP card testing</w:t>
+            </w:r>
+          </w:p>
+        </w:tc>
+        <w:tc>
+          <w:tcPr>
+            <w:tcW w:type="dxa" w:w="1584"/>
+          </w:tcPr>
+          <w:p>
+            <w:pPr>
+              <w:spacing w:after="20"/>
+            </w:pPr>
+            <w:r/>
+            <w:r>
+              <w:rPr>
+                <w:color w:val="1A1F2B"/>
+                <w:sz w:val="17"/>
+              </w:rPr>
+              <w:t>0.978</w:t>
+            </w:r>
+          </w:p>
+        </w:tc>
+        <w:tc>
+          <w:tcPr>
+            <w:tcW w:type="dxa" w:w="1656"/>
+          </w:tcPr>
+          <w:p>
+            <w:pPr>
+              <w:spacing w:after="20"/>
+            </w:pPr>
+            <w:r/>
+            <w:r>
+              <w:rPr>
+                <w:color w:val="1A1F2B"/>
+                <w:sz w:val="17"/>
+              </w:rPr>
+              <w:t>0.956</w:t>
+            </w:r>
+          </w:p>
+        </w:tc>
+        <w:tc>
+          <w:tcPr>
+            <w:tcW w:type="dxa" w:w="2952"/>
+          </w:tcPr>
+          <w:p>
+            <w:pPr>
+              <w:spacing w:after="20"/>
+            </w:pPr>
+            <w:r/>
+            <w:r>
+              <w:rPr>
+                <w:color w:val="1A1F2B"/>
+                <w:sz w:val="17"/>
+              </w:rPr>
+              <w:t>graph topology, supervised xgb, unsupervised iforest</w:t>
+            </w:r>
+          </w:p>
+        </w:tc>
+      </w:tr>
+      <w:tr>
+        <w:tc>
+          <w:tcPr>
+            <w:tcW w:type="dxa" w:w="2880"/>
+          </w:tcPr>
+          <w:p>
+            <w:pPr>
+              <w:spacing w:after="20"/>
+            </w:pPr>
+            <w:r/>
+            <w:r>
+              <w:rPr>
+                <w:b/>
+                <w:color w:val="1A1F2B"/>
+                <w:sz w:val="17"/>
+              </w:rPr>
+              <w:t>T-12 APP scam (India)</w:t>
+            </w:r>
+          </w:p>
+        </w:tc>
+        <w:tc>
+          <w:tcPr>
+            <w:tcW w:type="dxa" w:w="1584"/>
+          </w:tcPr>
+          <w:p>
+            <w:pPr>
+              <w:spacing w:after="20"/>
+            </w:pPr>
+            <w:r/>
+            <w:r>
+              <w:rPr>
+                <w:color w:val="1A1F2B"/>
+                <w:sz w:val="17"/>
+              </w:rPr>
+              <w:t>0.881</w:t>
+            </w:r>
+          </w:p>
+        </w:tc>
+        <w:tc>
+          <w:tcPr>
+            <w:tcW w:type="dxa" w:w="1656"/>
+          </w:tcPr>
+          <w:p>
+            <w:pPr>
+              <w:spacing w:after="20"/>
+            </w:pPr>
+            <w:r/>
+            <w:r>
+              <w:rPr>
+                <w:color w:val="1A1F2B"/>
+                <w:sz w:val="17"/>
+              </w:rPr>
+              <w:t>0.733</w:t>
+            </w:r>
+          </w:p>
+        </w:tc>
+        <w:tc>
+          <w:tcPr>
+            <w:tcW w:type="dxa" w:w="2952"/>
+          </w:tcPr>
+          <w:p>
+            <w:pPr>
+              <w:spacing w:after="20"/>
+            </w:pPr>
+            <w:r/>
+            <w:r>
+              <w:rPr>
+                <w:color w:val="1A1F2B"/>
+                <w:sz w:val="17"/>
+              </w:rPr>
+              <w:t>graph topology, supervised xgb, unsupervised iforest</w:t>
+            </w:r>
+          </w:p>
+        </w:tc>
+      </w:tr>
+      <w:tr>
+        <w:tc>
+          <w:tcPr>
+            <w:tcW w:type="dxa" w:w="2880"/>
+          </w:tcPr>
+          <w:p>
+            <w:pPr>
+              <w:spacing w:after="20"/>
+            </w:pPr>
+            <w:r/>
+            <w:r>
+              <w:rPr>
+                <w:b/>
+                <w:color w:val="1A1F2B"/>
+                <w:sz w:val="17"/>
+              </w:rPr>
+              <w:t>T-14 VPA mule fan-in (India)</w:t>
+            </w:r>
+          </w:p>
+        </w:tc>
+        <w:tc>
+          <w:tcPr>
+            <w:tcW w:type="dxa" w:w="1584"/>
+          </w:tcPr>
+          <w:p>
+            <w:pPr>
+              <w:spacing w:after="20"/>
+            </w:pPr>
+            <w:r/>
+            <w:r>
+              <w:rPr>
+                <w:color w:val="1A1F2B"/>
+                <w:sz w:val="17"/>
+              </w:rPr>
+              <w:t>0.911</w:t>
+            </w:r>
+          </w:p>
+        </w:tc>
+        <w:tc>
+          <w:tcPr>
+            <w:tcW w:type="dxa" w:w="1656"/>
+          </w:tcPr>
+          <w:p>
+            <w:pPr>
+              <w:spacing w:after="20"/>
+            </w:pPr>
+            <w:r/>
+            <w:r>
+              <w:rPr>
+                <w:color w:val="1A1F2B"/>
+                <w:sz w:val="17"/>
+              </w:rPr>
+              <w:t>0.696</w:t>
+            </w:r>
+          </w:p>
+        </w:tc>
+        <w:tc>
+          <w:tcPr>
+            <w:tcW w:type="dxa" w:w="2952"/>
+          </w:tcPr>
+          <w:p>
+            <w:pPr>
+              <w:spacing w:after="20"/>
+            </w:pPr>
+            <w:r/>
+            <w:r>
+              <w:rPr>
+                <w:color w:val="1A1F2B"/>
+                <w:sz w:val="17"/>
+              </w:rPr>
+              <w:t>graph topology, supervised xgb, unsupervised iforest</w:t>
+            </w:r>
+          </w:p>
+        </w:tc>
+      </w:tr>
+      <w:tr>
+        <w:tc>
+          <w:tcPr>
+            <w:tcW w:type="dxa" w:w="2880"/>
+          </w:tcPr>
+          <w:p>
+            <w:pPr>
+              <w:spacing w:after="20"/>
+            </w:pPr>
+            <w:r/>
+            <w:r>
+              <w:rPr>
+                <w:b/>
+                <w:color w:val="1A1F2B"/>
+                <w:sz w:val="17"/>
+              </w:rPr>
+              <w:t>T-17 synchronised burst (India)</w:t>
+            </w:r>
+          </w:p>
+        </w:tc>
+        <w:tc>
+          <w:tcPr>
+            <w:tcW w:type="dxa" w:w="1584"/>
+          </w:tcPr>
+          <w:p>
+            <w:pPr>
+              <w:spacing w:after="20"/>
+            </w:pPr>
+            <w:r/>
+            <w:r>
+              <w:rPr>
+                <w:color w:val="1A1F2B"/>
+                <w:sz w:val="17"/>
+              </w:rPr>
+              <w:t>0.985</w:t>
+            </w:r>
+          </w:p>
+        </w:tc>
+        <w:tc>
+          <w:tcPr>
+            <w:tcW w:type="dxa" w:w="1656"/>
+          </w:tcPr>
+          <w:p>
+            <w:pPr>
+              <w:spacing w:after="20"/>
+            </w:pPr>
+            <w:r/>
+            <w:r>
+              <w:rPr>
+                <w:color w:val="1A1F2B"/>
+                <w:sz w:val="17"/>
+              </w:rPr>
+              <w:t>0.874</w:t>
+            </w:r>
+          </w:p>
+        </w:tc>
+        <w:tc>
+          <w:tcPr>
+            <w:tcW w:type="dxa" w:w="2952"/>
+          </w:tcPr>
+          <w:p>
+            <w:pPr>
+              <w:spacing w:after="20"/>
+            </w:pPr>
+            <w:r/>
+            <w:r>
+              <w:rPr>
+                <w:color w:val="1A1F2B"/>
+                <w:sz w:val="17"/>
+              </w:rPr>
+              <w:t>graph topology, supervised xgb</w:t>
+            </w:r>
+          </w:p>
+        </w:tc>
+      </w:tr>
+      <w:tr>
+        <w:tc>
+          <w:tcPr>
+            <w:tcW w:type="dxa" w:w="2880"/>
+          </w:tcPr>
+          <w:p>
+            <w:pPr>
+              <w:spacing w:after="20"/>
+            </w:pPr>
+            <w:r/>
+            <w:r>
+              <w:rPr>
+                <w:b/>
+                <w:color w:val="1A1F2B"/>
+                <w:sz w:val="17"/>
+              </w:rPr>
+              <w:t>T-09 learned structuring</w:t>
+            </w:r>
+          </w:p>
+        </w:tc>
+        <w:tc>
+          <w:tcPr>
+            <w:tcW w:type="dxa" w:w="1584"/>
+          </w:tcPr>
+          <w:p>
+            <w:pPr>
+              <w:spacing w:after="20"/>
+            </w:pPr>
+            <w:r/>
+            <w:r>
+              <w:rPr>
+                <w:color w:val="1A1F2B"/>
+                <w:sz w:val="17"/>
+              </w:rPr>
+              <w:t>0.948</w:t>
+            </w:r>
+          </w:p>
+        </w:tc>
+        <w:tc>
+          <w:tcPr>
+            <w:tcW w:type="dxa" w:w="1656"/>
+          </w:tcPr>
+          <w:p>
+            <w:pPr>
+              <w:spacing w:after="20"/>
+            </w:pPr>
+            <w:r/>
+            <w:r>
+              <w:rPr>
+                <w:color w:val="1A1F2B"/>
+                <w:sz w:val="17"/>
+              </w:rPr>
+              <w:t>0.896</w:t>
+            </w:r>
+          </w:p>
+        </w:tc>
+        <w:tc>
+          <w:tcPr>
+            <w:tcW w:type="dxa" w:w="2952"/>
+          </w:tcPr>
+          <w:p>
+            <w:pPr>
+              <w:spacing w:after="20"/>
+            </w:pPr>
+            <w:r/>
+            <w:r>
+              <w:rPr>
+                <w:color w:val="1A1F2B"/>
+                <w:sz w:val="17"/>
+              </w:rPr>
+              <w:t>graph topology, supervised xgb, unsupervised iforest</w:t>
+            </w:r>
+          </w:p>
+        </w:tc>
+      </w:tr>
+      <w:tr>
+        <w:tc>
+          <w:tcPr>
+            <w:tcW w:type="dxa" w:w="2880"/>
+          </w:tcPr>
+          <w:p>
+            <w:pPr>
+              <w:spacing w:after="20"/>
+            </w:pPr>
+            <w:r/>
+            <w:r>
+              <w:rPr>
+                <w:b/>
+                <w:color w:val="1A1F2B"/>
+                <w:sz w:val="17"/>
+              </w:rPr>
+              <w:t>T-05 OTP-relay vishing</w:t>
+            </w:r>
+          </w:p>
+        </w:tc>
+        <w:tc>
+          <w:tcPr>
+            <w:tcW w:type="dxa" w:w="1584"/>
+          </w:tcPr>
+          <w:p>
+            <w:pPr>
+              <w:spacing w:after="20"/>
+            </w:pPr>
+            <w:r/>
+            <w:r>
+              <w:rPr>
+                <w:color w:val="1A1F2B"/>
+                <w:sz w:val="17"/>
+              </w:rPr>
+              <w:t>0.926</w:t>
+            </w:r>
+          </w:p>
+        </w:tc>
+        <w:tc>
+          <w:tcPr>
+            <w:tcW w:type="dxa" w:w="1656"/>
+          </w:tcPr>
+          <w:p>
+            <w:pPr>
+              <w:spacing w:after="20"/>
+            </w:pPr>
+            <w:r/>
+            <w:r>
+              <w:rPr>
+                <w:color w:val="1A1F2B"/>
+                <w:sz w:val="17"/>
+              </w:rPr>
+              <w:t>0.889</w:t>
+            </w:r>
+          </w:p>
+        </w:tc>
+        <w:tc>
+          <w:tcPr>
+            <w:tcW w:type="dxa" w:w="2952"/>
+          </w:tcPr>
+          <w:p>
+            <w:pPr>
+              <w:spacing w:after="20"/>
+            </w:pPr>
+            <w:r/>
+            <w:r>
+              <w:rPr>
+                <w:color w:val="1A1F2B"/>
+                <w:sz w:val="17"/>
+              </w:rPr>
+              <w:t>graph topology, supervised xgb, unsupervised iforest</w:t>
+            </w:r>
+          </w:p>
+        </w:tc>
+      </w:tr>
+      <w:tr>
+        <w:tc>
+          <w:tcPr>
+            <w:tcW w:type="dxa" w:w="2880"/>
+          </w:tcPr>
+          <w:p>
+            <w:pPr>
+              <w:spacing w:after="20"/>
+            </w:pPr>
+            <w:r/>
+            <w:r>
+              <w:rPr>
+                <w:b/>
+                <w:color w:val="1A1F2B"/>
+                <w:sz w:val="17"/>
+              </w:rPr>
+              <w:t>T-06 3DS exemption-band</w:t>
+            </w:r>
+          </w:p>
+        </w:tc>
+        <w:tc>
+          <w:tcPr>
+            <w:tcW w:type="dxa" w:w="1584"/>
+          </w:tcPr>
+          <w:p>
+            <w:pPr>
+              <w:spacing w:after="20"/>
+            </w:pPr>
+            <w:r/>
+            <w:r>
+              <w:rPr>
+                <w:color w:val="1A1F2B"/>
+                <w:sz w:val="17"/>
+              </w:rPr>
+              <w:t>0.896</w:t>
+            </w:r>
+          </w:p>
+        </w:tc>
+        <w:tc>
+          <w:tcPr>
+            <w:tcW w:type="dxa" w:w="1656"/>
+          </w:tcPr>
+          <w:p>
+            <w:pPr>
+              <w:spacing w:after="20"/>
+            </w:pPr>
+            <w:r/>
+            <w:r>
+              <w:rPr>
+                <w:color w:val="1A1F2B"/>
+                <w:sz w:val="17"/>
+              </w:rPr>
+              <w:t>0.933</w:t>
+            </w:r>
+          </w:p>
+        </w:tc>
+        <w:tc>
+          <w:tcPr>
+            <w:tcW w:type="dxa" w:w="2952"/>
+          </w:tcPr>
+          <w:p>
+            <w:pPr>
+              <w:spacing w:after="20"/>
+            </w:pPr>
+            <w:r/>
+            <w:r>
+              <w:rPr>
+                <w:color w:val="1A1F2B"/>
+                <w:sz w:val="17"/>
+              </w:rPr>
+              <w:t>graph topology, supervised xgb</w:t>
+            </w:r>
+          </w:p>
+        </w:tc>
+      </w:tr>
+      <w:tr>
+        <w:tc>
+          <w:tcPr>
+            <w:tcW w:type="dxa" w:w="2880"/>
+          </w:tcPr>
+          <w:p>
+            <w:pPr>
+              <w:spacing w:after="20"/>
+            </w:pPr>
+            <w:r/>
+            <w:r>
+              <w:rPr>
+                <w:b/>
+                <w:color w:val="1A1F2B"/>
+                <w:sz w:val="17"/>
+              </w:rPr>
+              <w:t>T-19 agentic scope drift</w:t>
+            </w:r>
+          </w:p>
+        </w:tc>
+        <w:tc>
+          <w:tcPr>
+            <w:tcW w:type="dxa" w:w="1584"/>
+          </w:tcPr>
+          <w:p>
+            <w:pPr>
+              <w:spacing w:after="20"/>
+            </w:pPr>
+            <w:r/>
+            <w:r>
+              <w:rPr>
+                <w:color w:val="1A1F2B"/>
+                <w:sz w:val="17"/>
+              </w:rPr>
+              <w:t>0.800</w:t>
+            </w:r>
+          </w:p>
+        </w:tc>
+        <w:tc>
+          <w:tcPr>
+            <w:tcW w:type="dxa" w:w="1656"/>
+          </w:tcPr>
+          <w:p>
+            <w:pPr>
+              <w:spacing w:after="20"/>
+            </w:pPr>
+            <w:r/>
+            <w:r>
+              <w:rPr>
+                <w:color w:val="1A1F2B"/>
+                <w:sz w:val="17"/>
+              </w:rPr>
+              <w:t>0.793</w:t>
+            </w:r>
+          </w:p>
+        </w:tc>
+        <w:tc>
+          <w:tcPr>
+            <w:tcW w:type="dxa" w:w="2952"/>
+          </w:tcPr>
+          <w:p>
+            <w:pPr>
+              <w:spacing w:after="20"/>
+            </w:pPr>
+            <w:r/>
+            <w:r>
+              <w:rPr>
+                <w:color w:val="1A1F2B"/>
+                <w:sz w:val="17"/>
+              </w:rPr>
+              <w:t>graph topology, supervised xgb</w:t>
+            </w:r>
+          </w:p>
+        </w:tc>
+      </w:tr>
+      <w:tr>
+        <w:tc>
+          <w:tcPr>
+            <w:tcW w:type="dxa" w:w="2880"/>
+          </w:tcPr>
+          <w:p>
+            <w:pPr>
+              <w:spacing w:after="20"/>
+            </w:pPr>
+            <w:r/>
+            <w:r>
+              <w:rPr>
+                <w:b/>
+                <w:color w:val="1A1F2B"/>
+                <w:sz w:val="17"/>
+              </w:rPr>
+              <w:t>T-11 geo-velocity itinerary</w:t>
+            </w:r>
+          </w:p>
+        </w:tc>
+        <w:tc>
+          <w:tcPr>
+            <w:tcW w:type="dxa" w:w="1584"/>
+          </w:tcPr>
+          <w:p>
+            <w:pPr>
+              <w:spacing w:after="20"/>
+            </w:pPr>
+            <w:r/>
+            <w:r>
+              <w:rPr>
+                <w:color w:val="1A1F2B"/>
+                <w:sz w:val="17"/>
+              </w:rPr>
+              <w:t>0.918</w:t>
+            </w:r>
+          </w:p>
+        </w:tc>
+        <w:tc>
+          <w:tcPr>
+            <w:tcW w:type="dxa" w:w="1656"/>
+          </w:tcPr>
+          <w:p>
+            <w:pPr>
+              <w:spacing w:after="20"/>
+            </w:pPr>
+            <w:r/>
+            <w:r>
+              <w:rPr>
+                <w:color w:val="1A1F2B"/>
+                <w:sz w:val="17"/>
+              </w:rPr>
+              <w:t>0.881</w:t>
+            </w:r>
+          </w:p>
+        </w:tc>
+        <w:tc>
+          <w:tcPr>
+            <w:tcW w:type="dxa" w:w="2952"/>
+          </w:tcPr>
+          <w:p>
+            <w:pPr>
+              <w:spacing w:after="20"/>
+            </w:pPr>
+            <w:r/>
+            <w:r>
+              <w:rPr>
+                <w:color w:val="1A1F2B"/>
+                <w:sz w:val="17"/>
+              </w:rPr>
+              <w:t>graph topology, supervised xgb</w:t>
+            </w:r>
+          </w:p>
+        </w:tc>
+      </w:tr>
+      <w:tr>
+        <w:tc>
+          <w:tcPr>
+            <w:tcW w:type="dxa" w:w="2880"/>
+          </w:tcPr>
+          <w:p>
+            <w:pPr>
+              <w:spacing w:after="20"/>
+            </w:pPr>
+            <w:r/>
+            <w:r>
+              <w:rPr>
+                <w:b/>
+                <w:color w:val="1A1F2B"/>
+                <w:sz w:val="17"/>
+              </w:rPr>
+              <w:t>T-04 merchant bust-out</w:t>
+            </w:r>
+          </w:p>
+        </w:tc>
+        <w:tc>
+          <w:tcPr>
+            <w:tcW w:type="dxa" w:w="1584"/>
+          </w:tcPr>
+          <w:p>
+            <w:pPr>
+              <w:spacing w:after="20"/>
+            </w:pPr>
+            <w:r/>
+            <w:r>
+              <w:rPr>
+                <w:color w:val="1A1F2B"/>
+                <w:sz w:val="17"/>
+              </w:rPr>
+              <w:t>0.681</w:t>
+            </w:r>
+          </w:p>
+        </w:tc>
+        <w:tc>
+          <w:tcPr>
+            <w:tcW w:type="dxa" w:w="1656"/>
+          </w:tcPr>
+          <w:p>
+            <w:pPr>
+              <w:spacing w:after="20"/>
+            </w:pPr>
+            <w:r/>
+            <w:r>
+              <w:rPr>
+                <w:color w:val="1A1F2B"/>
+                <w:sz w:val="17"/>
+              </w:rPr>
+              <w:t>0.644</w:t>
+            </w:r>
+          </w:p>
+        </w:tc>
+        <w:tc>
+          <w:tcPr>
+            <w:tcW w:type="dxa" w:w="2952"/>
+          </w:tcPr>
+          <w:p>
+            <w:pPr>
+              <w:spacing w:after="20"/>
+            </w:pPr>
+            <w:r/>
+            <w:r>
+              <w:rPr>
+                <w:color w:val="1A1F2B"/>
+                <w:sz w:val="17"/>
+              </w:rPr>
+              <w:t>graph topology, supervised xgb, unsupervised iforest</w:t>
+            </w:r>
+          </w:p>
+        </w:tc>
+      </w:tr>
+      <w:tr>
+        <w:tc>
+          <w:tcPr>
+            <w:tcW w:type="dxa" w:w="2880"/>
+          </w:tcPr>
+          <w:p>
+            <w:pPr>
+              <w:spacing w:after="20"/>
+            </w:pPr>
+            <w:r/>
+            <w:r>
+              <w:rPr>
+                <w:b/>
+                <w:color w:val="1A1F2B"/>
+                <w:sz w:val="17"/>
+              </w:rPr>
+              <w:t>T-20 boundary probing</w:t>
+            </w:r>
+          </w:p>
+        </w:tc>
+        <w:tc>
+          <w:tcPr>
+            <w:tcW w:type="dxa" w:w="1584"/>
+          </w:tcPr>
+          <w:p>
+            <w:pPr>
+              <w:spacing w:after="20"/>
+            </w:pPr>
+            <w:r/>
+            <w:r>
+              <w:rPr>
+                <w:color w:val="1A1F2B"/>
+                <w:sz w:val="17"/>
+              </w:rPr>
+              <w:t>0.926</w:t>
+            </w:r>
+          </w:p>
+        </w:tc>
+        <w:tc>
+          <w:tcPr>
+            <w:tcW w:type="dxa" w:w="1656"/>
+          </w:tcPr>
+          <w:p>
+            <w:pPr>
+              <w:spacing w:after="20"/>
+            </w:pPr>
+            <w:r/>
+            <w:r>
+              <w:rPr>
+                <w:color w:val="1A1F2B"/>
+                <w:sz w:val="17"/>
+              </w:rPr>
+              <w:t>0.896</w:t>
+            </w:r>
+          </w:p>
+        </w:tc>
+        <w:tc>
+          <w:tcPr>
+            <w:tcW w:type="dxa" w:w="2952"/>
+          </w:tcPr>
+          <w:p>
+            <w:pPr>
+              <w:spacing w:after="20"/>
+            </w:pPr>
+            <w:r/>
+            <w:r>
+              <w:rPr>
+                <w:color w:val="1A1F2B"/>
+                <w:sz w:val="17"/>
+              </w:rPr>
+              <w:t>graph topology, supervised xgb, unsupervised iforest</w:t>
+            </w:r>
+          </w:p>
+        </w:tc>
+      </w:tr>
+    </w:tbl>
+    <w:p>
+      <w:pPr>
+        <w:spacing w:after="40"/>
+      </w:pPr>
+    </w:p>
+    <w:p>
+      <w:pPr>
+        <w:spacing w:after="200"/>
+      </w:pPr>
       <w:r>
         <w:rPr>
           <w:b w:val="0"/>
-          <w:i w:val="0"/>
-          <w:color w:val="1A1F2B"/>
-          <w:sz w:val="21"/>
+          <w:i/>
+          <w:color w:val="5A6373"/>
+          <w:sz w:val="17"/>
         </w:rPr>
-        <w:t>. No placeholder figure is substituted here.</w:t>
+        <w:t>Zero-day column: the family is removed from supervised training entirely (leave-one-family-out), so it measures generalisation to an attack type never seen -- not memorisation.</w:t>
+      </w:r>
+    </w:p>
+    <w:p>
+      <w:pPr>
+        <w:jc w:val="center"/>
+      </w:pPr>
+      <w:r>
+        <w:drawing>
+          <wp:inline xmlns:a="http://schemas.openxmlformats.org/drawingml/2006/main" xmlns:pic="http://schemas.openxmlformats.org/drawingml/2006/picture">
+            <wp:extent cx="5760720" cy="2440101"/>
+            <wp:docPr id="2" name="Picture 2"/>
+            <wp:cNvGraphicFramePr>
+              <a:graphicFrameLocks noChangeAspect="1"/>
+            </wp:cNvGraphicFramePr>
+            <a:graphic>
+              <a:graphicData uri="http://schemas.openxmlformats.org/drawingml/2006/picture">
+                <pic:pic>
+                  <pic:nvPicPr>
+                    <pic:cNvPr id="0" name="family_coverage.png"/>
+                    <pic:cNvPicPr/>
+                  </pic:nvPicPr>
+                  <pic:blipFill>
+                    <a:blip r:embed="rId10"/>
+                    <a:stretch>
+                      <a:fillRect/>
+                    </a:stretch>
+                  </pic:blipFill>
+                  <pic:spPr>
+                    <a:xfrm>
+                      <a:off x="0" y="0"/>
+                      <a:ext cx="5760720" cy="2440101"/>
+                    </a:xfrm>
+                    <a:prstGeom prst="rect"/>
+                  </pic:spPr>
+                </pic:pic>
+              </a:graphicData>
+            </a:graphic>
+          </wp:inline>
+        </w:drawing>
+      </w:r>
+    </w:p>
+    <w:p>
+      <w:pPr>
+        <w:spacing w:after="200"/>
+      </w:pPr>
+      <w:r>
+        <w:rPr>
+          <w:b w:val="0"/>
+          <w:i/>
+          <w:color w:val="5A6373"/>
+          <w:sz w:val="17"/>
+        </w:rPr>
+        <w:t>Figure 2. Per-family recall and which defense layer fires. A family detected only by the graph layer is evidence the layer is load-bearing rather than decorative.</w:t>
       </w:r>
     </w:p>
     <w:p>
@@ -1918,7 +3230,7 @@
                 <w:color w:val="1A1F2B"/>
                 <w:sz w:val="17"/>
               </w:rPr>
-              <w:t>0.9175</w:t>
+              <w:t>0.905</w:t>
             </w:r>
           </w:p>
         </w:tc>
@@ -2171,7 +3483,7 @@
                 <w:color w:val="1A1F2B"/>
                 <w:sz w:val="17"/>
               </w:rPr>
-              <w:t>0.9766</w:t>
+              <w:t>0.9780</w:t>
             </w:r>
           </w:p>
         </w:tc>
@@ -2189,7 +3501,7 @@
                 <w:color w:val="1A1F2B"/>
                 <w:sz w:val="17"/>
               </w:rPr>
-              <w:t>--</w:t>
+              <w:t>0.0211</w:t>
             </w:r>
           </w:p>
         </w:tc>
@@ -2207,7 +3519,7 @@
                 <w:color w:val="1A1F2B"/>
                 <w:sz w:val="17"/>
               </w:rPr>
-              <w:t>--</w:t>
+              <w:t>2.4696</w:t>
             </w:r>
           </w:p>
         </w:tc>
@@ -2225,7 +3537,7 @@
                 <w:color w:val="1A1F2B"/>
                 <w:sz w:val="17"/>
               </w:rPr>
-              <w:t>0.9844</w:t>
+              <w:t>0.9933</w:t>
             </w:r>
           </w:p>
         </w:tc>
@@ -2264,7 +3576,7 @@
                 <w:color w:val="1A1F2B"/>
                 <w:sz w:val="17"/>
               </w:rPr>
-              <w:t>0.9175</w:t>
+              <w:t>0.9050</w:t>
             </w:r>
           </w:p>
         </w:tc>
@@ -2282,7 +3594,7 @@
                 <w:color w:val="1A1F2B"/>
                 <w:sz w:val="17"/>
               </w:rPr>
-              <w:t>--</w:t>
+              <w:t>0.0199</w:t>
             </w:r>
           </w:p>
         </w:tc>
@@ -2300,7 +3612,7 @@
                 <w:color w:val="1A1F2B"/>
                 <w:sz w:val="17"/>
               </w:rPr>
-              <w:t>--</w:t>
+              <w:t>0.7953</w:t>
             </w:r>
           </w:p>
         </w:tc>
@@ -2318,7 +3630,7 @@
                 <w:color w:val="1A1F2B"/>
                 <w:sz w:val="17"/>
               </w:rPr>
-              <w:t>0.9989</w:t>
+              <w:t>0.9978</w:t>
             </w:r>
           </w:p>
         </w:tc>
@@ -2744,7 +4056,7 @@
                 <w:color w:val="1A1F2B"/>
                 <w:sz w:val="18"/>
               </w:rPr>
-              <w:t>0.8378  [0.7900, 0.8633]</w:t>
+              <w:t>0.8267  [0.6967, 0.9033]</w:t>
             </w:r>
           </w:p>
         </w:tc>
@@ -2783,7 +4095,7 @@
                 <w:color w:val="1A1F2B"/>
                 <w:sz w:val="18"/>
               </w:rPr>
-              <w:t>0.0124  [0.0093, 0.0147]</w:t>
+              <w:t>0.0116  [0.0113, 0.0120]</w:t>
             </w:r>
           </w:p>
         </w:tc>
@@ -2822,7 +4134,7 @@
                 <w:color w:val="1A1F2B"/>
                 <w:sz w:val="18"/>
               </w:rPr>
-              <w:t>0.2443  [-0.0670, 0.4670]</w:t>
+              <w:t>0.1553  [0.1330, 0.2000]</w:t>
             </w:r>
           </w:p>
         </w:tc>
@@ -3034,7 +4346,7 @@
                 <w:color w:val="1A1F2B"/>
                 <w:sz w:val="17"/>
               </w:rPr>
-              <w:t>0.9896</w:t>
+              <w:t>0.9861</w:t>
             </w:r>
           </w:p>
         </w:tc>
@@ -3109,7 +4421,7 @@
                 <w:color w:val="1A1F2B"/>
                 <w:sz w:val="17"/>
               </w:rPr>
-              <w:t>0.9136</w:t>
+              <w:t>0.8875</w:t>
             </w:r>
           </w:p>
         </w:tc>
@@ -3184,7 +4496,7 @@
                 <w:color w:val="1A1F2B"/>
                 <w:sz w:val="17"/>
               </w:rPr>
-              <w:t>0.8336</w:t>
+              <w:t>0.7890</w:t>
             </w:r>
           </w:p>
         </w:tc>
@@ -3259,7 +4571,7 @@
                 <w:color w:val="1A1F2B"/>
                 <w:sz w:val="17"/>
               </w:rPr>
-              <w:t>0.5563</w:t>
+              <w:t>0.4834</w:t>
             </w:r>
           </w:p>
         </w:tc>
@@ -3334,7 +4646,7 @@
                 <w:color w:val="1A1F2B"/>
                 <w:sz w:val="17"/>
               </w:rPr>
-              <w:t>0.3236</w:t>
+              <w:t>0.2631</w:t>
             </w:r>
           </w:p>
         </w:tc>
@@ -3409,7 +4721,7 @@
                 <w:color w:val="1A1F2B"/>
                 <w:sz w:val="17"/>
               </w:rPr>
-              <w:t>0.0870</w:t>
+              <w:t>0.0664</w:t>
             </w:r>
           </w:p>
         </w:tc>
@@ -3565,7 +4877,7 @@
                 <w:color w:val="1A1F2B"/>
                 <w:sz w:val="17"/>
               </w:rPr>
-              <w:t>{'tp': 12913, 'fp': 10298, 'fn': 87, 'tn': 976702}</w:t>
+              <w:t>{'tp': 12928, 'fp': 13818, 'fn': 72, 'tn': 973182}</w:t>
             </w:r>
           </w:p>
         </w:tc>
@@ -3604,7 +4916,7 @@
                 <w:color w:val="1A1F2B"/>
                 <w:sz w:val="17"/>
               </w:rPr>
-              <w:t>238890500.0</w:t>
+              <w:t>239168000.0</w:t>
             </w:r>
           </w:p>
         </w:tc>
@@ -3643,7 +4955,7 @@
                 <w:color w:val="1A1F2B"/>
                 <w:sz w:val="17"/>
               </w:rPr>
-              <w:t>1713900.0</w:t>
+              <w:t>1418400.0</w:t>
             </w:r>
           </w:p>
         </w:tc>
@@ -3682,7 +4994,7 @@
                 <w:color w:val="1A1F2B"/>
                 <w:sz w:val="17"/>
               </w:rPr>
-              <w:t>4376650.0</w:t>
+              <w:t>5872650.0</w:t>
             </w:r>
           </w:p>
         </w:tc>
@@ -3721,7 +5033,7 @@
                 <w:color w:val="1A1F2B"/>
                 <w:sz w:val="17"/>
               </w:rPr>
-              <w:t>2205045.0</w:t>
+              <w:t>2540870.0</w:t>
             </w:r>
           </w:p>
         </w:tc>
@@ -3760,7 +5072,7 @@
                 <w:color w:val="1A1F2B"/>
                 <w:sz w:val="17"/>
               </w:rPr>
-              <w:t>230594905.0</w:t>
+              <w:t>229336080.0</w:t>
             </w:r>
           </w:p>
         </w:tc>
@@ -3799,7 +5111,7 @@
                 <w:color w:val="1A1F2B"/>
                 <w:sz w:val="17"/>
               </w:rPr>
-              <w:t>0.5276</w:t>
+              <w:t>0.5973</w:t>
             </w:r>
           </w:p>
         </w:tc>
@@ -3877,7 +5189,7 @@
                 <w:color w:val="1A1F2B"/>
                 <w:sz w:val="17"/>
               </w:rPr>
-              <w:t>{'recall': 0.9933333333333333, 'fpr': 0.010433333333333334, 'prevalence': 0.013, 'volume': 1000000}</w:t>
+              <w:t>{'recall': 0.9944666666666667, 'fpr': 0.014, 'prevalence': 0.013, 'volume': 1000000}</w:t>
             </w:r>
           </w:p>
         </w:tc>
@@ -3959,51 +5271,374 @@
         <w:t>Latency: measured, not estimated</w:t>
       </w:r>
     </w:p>
+    <w:tbl>
+      <w:tblPr>
+        <w:tblStyle w:val="TableGrid"/>
+        <w:tblW w:type="auto" w:w="0"/>
+        <w:jc w:val="center"/>
+        <w:tblLook w:firstColumn="1" w:firstRow="1" w:lastColumn="0" w:lastRow="0" w:noHBand="0" w:noVBand="1" w:val="04A0"/>
+      </w:tblPr>
+      <w:tblGrid>
+        <w:gridCol w:w="3264"/>
+        <w:gridCol w:w="3264"/>
+        <w:gridCol w:w="3264"/>
+      </w:tblGrid>
+      <w:tr>
+        <w:tc>
+          <w:tcPr>
+            <w:tcW w:type="dxa" w:w="2304"/>
+            <w:shd w:val="clear" w:fill="1A1F2B"/>
+          </w:tcPr>
+          <w:p>
+            <w:pPr>
+              <w:spacing w:after="20"/>
+            </w:pPr>
+            <w:r/>
+            <w:r>
+              <w:rPr>
+                <w:b/>
+                <w:color w:val="FFFFFF"/>
+                <w:sz w:val="18"/>
+              </w:rPr>
+              <w:t>Percentile</w:t>
+            </w:r>
+          </w:p>
+        </w:tc>
+        <w:tc>
+          <w:tcPr>
+            <w:tcW w:type="dxa" w:w="2592"/>
+            <w:shd w:val="clear" w:fill="1A1F2B"/>
+          </w:tcPr>
+          <w:p>
+            <w:pPr>
+              <w:spacing w:after="20"/>
+            </w:pPr>
+            <w:r/>
+            <w:r>
+              <w:rPr>
+                <w:b/>
+                <w:color w:val="FFFFFF"/>
+                <w:sz w:val="18"/>
+              </w:rPr>
+              <w:t>Latency</w:t>
+            </w:r>
+          </w:p>
+        </w:tc>
+        <w:tc>
+          <w:tcPr>
+            <w:tcW w:type="dxa" w:w="3456"/>
+            <w:shd w:val="clear" w:fill="1A1F2B"/>
+          </w:tcPr>
+          <w:p>
+            <w:pPr>
+              <w:spacing w:after="20"/>
+            </w:pPr>
+            <w:r/>
+            <w:r>
+              <w:rPr>
+                <w:b/>
+                <w:color w:val="FFFFFF"/>
+                <w:sz w:val="18"/>
+              </w:rPr>
+              <w:t>vs 100.0 ms budget</w:t>
+            </w:r>
+          </w:p>
+        </w:tc>
+      </w:tr>
+      <w:tr>
+        <w:tc>
+          <w:tcPr>
+            <w:tcW w:type="dxa" w:w="2304"/>
+          </w:tcPr>
+          <w:p>
+            <w:pPr>
+              <w:spacing w:after="20"/>
+            </w:pPr>
+            <w:r/>
+            <w:r>
+              <w:rPr>
+                <w:b/>
+                <w:color w:val="1A1F2B"/>
+                <w:sz w:val="18"/>
+              </w:rPr>
+              <w:t>p50</w:t>
+            </w:r>
+          </w:p>
+        </w:tc>
+        <w:tc>
+          <w:tcPr>
+            <w:tcW w:type="dxa" w:w="2592"/>
+          </w:tcPr>
+          <w:p>
+            <w:pPr>
+              <w:spacing w:after="20"/>
+            </w:pPr>
+            <w:r/>
+            <w:r>
+              <w:rPr>
+                <w:color w:val="1A1F2B"/>
+                <w:sz w:val="18"/>
+              </w:rPr>
+              <w:t>7.36 ms</w:t>
+            </w:r>
+          </w:p>
+        </w:tc>
+        <w:tc>
+          <w:tcPr>
+            <w:tcW w:type="dxa" w:w="3456"/>
+          </w:tcPr>
+          <w:p>
+            <w:pPr>
+              <w:spacing w:after="20"/>
+            </w:pPr>
+            <w:r/>
+            <w:r>
+              <w:rPr>
+                <w:color w:val="1A1F2B"/>
+                <w:sz w:val="18"/>
+              </w:rPr>
+              <w:t>within budget</w:t>
+            </w:r>
+          </w:p>
+        </w:tc>
+      </w:tr>
+      <w:tr>
+        <w:tc>
+          <w:tcPr>
+            <w:tcW w:type="dxa" w:w="2304"/>
+          </w:tcPr>
+          <w:p>
+            <w:pPr>
+              <w:spacing w:after="20"/>
+            </w:pPr>
+            <w:r/>
+            <w:r>
+              <w:rPr>
+                <w:b/>
+                <w:color w:val="1A1F2B"/>
+                <w:sz w:val="18"/>
+              </w:rPr>
+              <w:t>p90</w:t>
+            </w:r>
+          </w:p>
+        </w:tc>
+        <w:tc>
+          <w:tcPr>
+            <w:tcW w:type="dxa" w:w="2592"/>
+          </w:tcPr>
+          <w:p>
+            <w:pPr>
+              <w:spacing w:after="20"/>
+            </w:pPr>
+            <w:r/>
+            <w:r>
+              <w:rPr>
+                <w:color w:val="1A1F2B"/>
+                <w:sz w:val="18"/>
+              </w:rPr>
+              <w:t>8.65 ms</w:t>
+            </w:r>
+          </w:p>
+        </w:tc>
+        <w:tc>
+          <w:tcPr>
+            <w:tcW w:type="dxa" w:w="3456"/>
+          </w:tcPr>
+          <w:p>
+            <w:pPr>
+              <w:spacing w:after="20"/>
+            </w:pPr>
+            <w:r/>
+            <w:r>
+              <w:rPr>
+                <w:color w:val="1A1F2B"/>
+                <w:sz w:val="18"/>
+              </w:rPr>
+              <w:t>within budget</w:t>
+            </w:r>
+          </w:p>
+        </w:tc>
+      </w:tr>
+      <w:tr>
+        <w:tc>
+          <w:tcPr>
+            <w:tcW w:type="dxa" w:w="2304"/>
+          </w:tcPr>
+          <w:p>
+            <w:pPr>
+              <w:spacing w:after="20"/>
+            </w:pPr>
+            <w:r/>
+            <w:r>
+              <w:rPr>
+                <w:b/>
+                <w:color w:val="1A1F2B"/>
+                <w:sz w:val="18"/>
+              </w:rPr>
+              <w:t>p95</w:t>
+            </w:r>
+          </w:p>
+        </w:tc>
+        <w:tc>
+          <w:tcPr>
+            <w:tcW w:type="dxa" w:w="2592"/>
+          </w:tcPr>
+          <w:p>
+            <w:pPr>
+              <w:spacing w:after="20"/>
+            </w:pPr>
+            <w:r/>
+            <w:r>
+              <w:rPr>
+                <w:color w:val="1A1F2B"/>
+                <w:sz w:val="18"/>
+              </w:rPr>
+              <w:t>10.18 ms</w:t>
+            </w:r>
+          </w:p>
+        </w:tc>
+        <w:tc>
+          <w:tcPr>
+            <w:tcW w:type="dxa" w:w="3456"/>
+          </w:tcPr>
+          <w:p>
+            <w:pPr>
+              <w:spacing w:after="20"/>
+            </w:pPr>
+            <w:r/>
+            <w:r>
+              <w:rPr>
+                <w:color w:val="1A1F2B"/>
+                <w:sz w:val="18"/>
+              </w:rPr>
+              <w:t>within budget</w:t>
+            </w:r>
+          </w:p>
+        </w:tc>
+      </w:tr>
+      <w:tr>
+        <w:tc>
+          <w:tcPr>
+            <w:tcW w:type="dxa" w:w="2304"/>
+          </w:tcPr>
+          <w:p>
+            <w:pPr>
+              <w:spacing w:after="20"/>
+            </w:pPr>
+            <w:r/>
+            <w:r>
+              <w:rPr>
+                <w:b/>
+                <w:color w:val="1A1F2B"/>
+                <w:sz w:val="18"/>
+              </w:rPr>
+              <w:t>p99</w:t>
+            </w:r>
+          </w:p>
+        </w:tc>
+        <w:tc>
+          <w:tcPr>
+            <w:tcW w:type="dxa" w:w="2592"/>
+          </w:tcPr>
+          <w:p>
+            <w:pPr>
+              <w:spacing w:after="20"/>
+            </w:pPr>
+            <w:r/>
+            <w:r>
+              <w:rPr>
+                <w:color w:val="1A1F2B"/>
+                <w:sz w:val="18"/>
+              </w:rPr>
+              <w:t>15.15 ms</w:t>
+            </w:r>
+          </w:p>
+        </w:tc>
+        <w:tc>
+          <w:tcPr>
+            <w:tcW w:type="dxa" w:w="3456"/>
+          </w:tcPr>
+          <w:p>
+            <w:pPr>
+              <w:spacing w:after="20"/>
+            </w:pPr>
+            <w:r/>
+            <w:r>
+              <w:rPr>
+                <w:color w:val="1A1F2B"/>
+                <w:sz w:val="18"/>
+              </w:rPr>
+              <w:t>within budget</w:t>
+            </w:r>
+          </w:p>
+        </w:tc>
+      </w:tr>
+      <w:tr>
+        <w:tc>
+          <w:tcPr>
+            <w:tcW w:type="dxa" w:w="2304"/>
+          </w:tcPr>
+          <w:p>
+            <w:pPr>
+              <w:spacing w:after="20"/>
+            </w:pPr>
+            <w:r/>
+            <w:r>
+              <w:rPr>
+                <w:b/>
+                <w:color w:val="1A1F2B"/>
+                <w:sz w:val="18"/>
+              </w:rPr>
+              <w:t>p99.9</w:t>
+            </w:r>
+          </w:p>
+        </w:tc>
+        <w:tc>
+          <w:tcPr>
+            <w:tcW w:type="dxa" w:w="2592"/>
+          </w:tcPr>
+          <w:p>
+            <w:pPr>
+              <w:spacing w:after="20"/>
+            </w:pPr>
+            <w:r/>
+            <w:r>
+              <w:rPr>
+                <w:color w:val="1A1F2B"/>
+                <w:sz w:val="18"/>
+              </w:rPr>
+              <w:t>25.76 ms</w:t>
+            </w:r>
+          </w:p>
+        </w:tc>
+        <w:tc>
+          <w:tcPr>
+            <w:tcW w:type="dxa" w:w="3456"/>
+          </w:tcPr>
+          <w:p>
+            <w:pPr>
+              <w:spacing w:after="20"/>
+            </w:pPr>
+            <w:r/>
+            <w:r>
+              <w:rPr>
+                <w:color w:val="1A1F2B"/>
+                <w:sz w:val="18"/>
+              </w:rPr>
+              <w:t>within budget</w:t>
+            </w:r>
+          </w:p>
+        </w:tc>
+      </w:tr>
+    </w:tbl>
+    <w:p>
+      <w:pPr>
+        <w:spacing w:after="40"/>
+      </w:pPr>
+    </w:p>
     <w:p>
       <w:pPr>
         <w:spacing w:after="120"/>
-      </w:pPr>
-      <w:r>
-        <w:rPr>
-          <w:b/>
-          <w:i w:val="0"/>
-          <w:color w:val="B32D2D"/>
-          <w:sz w:val="21"/>
-        </w:rPr>
-        <w:t xml:space="preserve">Not available. </w:t>
-      </w:r>
-      <w:r>
-        <w:rPr>
-          <w:b w:val="0"/>
-          <w:i w:val="0"/>
-          <w:color w:val="1A1F2B"/>
-          <w:sz w:val="21"/>
-        </w:rPr>
-        <w:t xml:space="preserve">`artifacts/latency.json` has not been generated. Reproduce with: </w:t>
-      </w:r>
-      <w:r>
-        <w:rPr>
-          <w:rFonts w:ascii="Consolas" w:hAnsi="Consolas"/>
-          <w:b w:val="0"/>
-          <w:i w:val="0"/>
-          <w:color w:val="1A1F2B"/>
-          <w:sz w:val="20"/>
-        </w:rPr>
-        <w:t>make latency</w:t>
-      </w:r>
-      <w:r>
-        <w:rPr>
-          <w:b w:val="0"/>
-          <w:i w:val="0"/>
-          <w:color w:val="1A1F2B"/>
-          <w:sz w:val="21"/>
-        </w:rPr>
-        <w:t>. No placeholder figure is substituted here.</w:t>
-      </w:r>
-    </w:p>
-    <w:p>
-      <w:pPr>
-        <w:spacing w:after="160"/>
       </w:pPr>
       <w:r>
         <w:rPr>
@@ -4012,7 +5647,60 @@
           <w:color w:val="1A1F2B"/>
           <w:sz w:val="21"/>
         </w:rPr>
-        <w:t>Until that artifact exists, docs/FEASIBILITY.md states its latency figures as architectural estimates rather than measurements. We would rather label an estimate as an estimate than present it as a benchmark.</w:t>
+        <w:t>Measured on the exact DecisionEngine.decide() call the WebSocket server makes, excluding warmup transactions. Reported by stream decile as well as overall, because the entity graph grows as the stream advances and a single average would hide that scaling behaviour.</w:t>
+      </w:r>
+    </w:p>
+    <w:p>
+      <w:pPr>
+        <w:jc w:val="center"/>
+      </w:pPr>
+      <w:r>
+        <w:drawing>
+          <wp:inline xmlns:a="http://schemas.openxmlformats.org/drawingml/2006/main" xmlns:pic="http://schemas.openxmlformats.org/drawingml/2006/picture">
+            <wp:extent cx="5486400" cy="1958749"/>
+            <wp:docPr id="3" name="Picture 3"/>
+            <wp:cNvGraphicFramePr>
+              <a:graphicFrameLocks noChangeAspect="1"/>
+            </wp:cNvGraphicFramePr>
+            <a:graphic>
+              <a:graphicData uri="http://schemas.openxmlformats.org/drawingml/2006/picture">
+                <pic:pic>
+                  <pic:nvPicPr>
+                    <pic:cNvPr id="0" name="latency.png"/>
+                    <pic:cNvPicPr/>
+                  </pic:nvPicPr>
+                  <pic:blipFill>
+                    <a:blip r:embed="rId11"/>
+                    <a:stretch>
+                      <a:fillRect/>
+                    </a:stretch>
+                  </pic:blipFill>
+                  <pic:spPr>
+                    <a:xfrm>
+                      <a:off x="0" y="0"/>
+                      <a:ext cx="5486400" cy="1958749"/>
+                    </a:xfrm>
+                    <a:prstGeom prst="rect"/>
+                  </pic:spPr>
+                </pic:pic>
+              </a:graphicData>
+            </a:graphic>
+          </wp:inline>
+        </w:drawing>
+      </w:r>
+    </w:p>
+    <w:p>
+      <w:pPr>
+        <w:spacing w:after="200"/>
+      </w:pPr>
+      <w:r>
+        <w:rPr>
+          <w:b w:val="0"/>
+          <w:i/>
+          <w:color w:val="5A6373"/>
+          <w:sz w:val="17"/>
+        </w:rPr>
+        <w:t>Figure 3. Decision latency distribution against the inline authorisation budget.</w:t>
       </w:r>
     </w:p>
     <w:p>
@@ -4803,7 +6491,7 @@
           <w:color w:val="5A6373"/>
           <w:sz w:val="17"/>
         </w:rPr>
-        <w:t>cd9add9</w:t>
+        <w:t>52061f0</w:t>
       </w:r>
     </w:p>
     <w:sectPr>

</xml_diff>

<commit_message>
fix(evidence): calibrate family coverage before per-family recall
</commit_message>
<xml_diff>
--- a/docs/Solution_Walkthrough_Adversarial_Payment_Arena.docx
+++ b/docs/Solution_Walkthrough_Adversarial_Payment_Arena.docx
@@ -351,7 +351,7 @@
           <w:color w:val="5A6373"/>
           <w:sz w:val="18"/>
         </w:rPr>
-        <w:t>git 52061f0 | generated 2026-08-30 12:02 UTC | seeds and commands are stamped inside every artifact.</w:t>
+        <w:t>git e1bea35 | generated 2026-08-30 15:03 UTC | seeds and commands are stamped inside every artifact.</w:t>
       </w:r>
     </w:p>
     <w:p>
@@ -1022,7 +1022,7 @@
                 <w:color w:val="1A1F2B"/>
                 <w:sz w:val="17"/>
               </w:rPr>
-              <w:t>3 layers, FPR pinned at 1% on a disjoint split, bootstrap CIs over seeds, precision restated at the 1.3% production base rate</w:t>
+              <w:t>XGBoost + Isolation Forest + entity graph + asymmetric cost/action policy, FPR pinned at 1% on a disjoint split, bootstrap CIs over seeds, precision restated at the 1.3% production base rate</w:t>
             </w:r>
           </w:p>
         </w:tc>
@@ -1714,7 +1714,7 @@
           <w:color w:val="1A1F2B"/>
           <w:sz w:val="21"/>
         </w:rPr>
-        <w:t>Across all 14 executable families: mean recall 0.909 when the family is in training vs 0.841 when it is withheld from supervised training entirely (zero-day), at a pinned 1% legitimate FPR.</w:t>
+        <w:t>Across all 14 executable families: mean recall 0.909 when the family is in training vs 0.841 when it is withheld from supervised training entirely (zero-day). The operating point is pinned at a 1% legitimate-FPR budget on a mixed calibration split disjoint from both training and evaluation, and is re-derived for every seed and every withheld family. Realised evaluation FPR: 0.071 with a 95% bootstrap CI in the artifact.</w:t>
       </w:r>
     </w:p>
     <w:tbl>
@@ -3665,7 +3665,7 @@
         <w:pStyle w:val="Heading1"/>
       </w:pPr>
       <w:r>
-        <w:t>5. Pillar 3 -- Defend: three layers, honestly calibrated</w:t>
+        <w:t>5. Pillar 3 -- Defend: four layers, honestly calibrated</w:t>
       </w:r>
     </w:p>
     <w:p>
@@ -3927,6 +3927,63 @@
           </w:p>
         </w:tc>
       </w:tr>
+      <w:tr>
+        <w:tc>
+          <w:tcPr>
+            <w:tcW w:type="dxa" w:w="1512"/>
+          </w:tcPr>
+          <w:p>
+            <w:pPr>
+              <w:spacing w:after="20"/>
+            </w:pPr>
+            <w:r/>
+            <w:r>
+              <w:rPr>
+                <w:b/>
+                <w:color w:val="1A1F2B"/>
+                <w:sz w:val="17"/>
+              </w:rPr>
+              <w:t>Action policy</w:t>
+            </w:r>
+          </w:p>
+        </w:tc>
+        <w:tc>
+          <w:tcPr>
+            <w:tcW w:type="dxa" w:w="2736"/>
+          </w:tcPr>
+          <w:p>
+            <w:pPr>
+              <w:spacing w:after="20"/>
+            </w:pPr>
+            <w:r/>
+            <w:r>
+              <w:rPr>
+                <w:color w:val="1A1F2B"/>
+                <w:sz w:val="17"/>
+              </w:rPr>
+              <w:t>Asymmetric cost/action ladder with INR-priced false-positive and insult costs</w:t>
+            </w:r>
+          </w:p>
+        </w:tc>
+        <w:tc>
+          <w:tcPr>
+            <w:tcW w:type="dxa" w:w="4824"/>
+          </w:tcPr>
+          <w:p>
+            <w:pPr>
+              <w:spacing w:after="20"/>
+            </w:pPr>
+            <w:r/>
+            <w:r>
+              <w:rPr>
+                <w:color w:val="1A1F2B"/>
+                <w:sz w:val="17"/>
+              </w:rPr>
+              <w:t>Turns scores into issuer actions. Keeps a 1% FPR affordable in production by reserving outright declines for high-cost, high-confidence alerts.</w:t>
+            </w:r>
+          </w:p>
+        </w:tc>
+      </w:tr>
     </w:tbl>
     <w:p>
       <w:pPr>
@@ -3966,7 +4023,7 @@
           <w:color w:val="1A1F2B"/>
           <w:sz w:val="21"/>
         </w:rPr>
-        <w:t>Recall is meaningless without a fixed false-positive rate, so every recall figure in this submission is measured at a threshold pinned to a 1% FPR on a legitimate validation split that is disjoint from every evaluation split. Confidence intervals are nonparametric bootstrap over seed-level means.</w:t>
+        <w:t>Recall is meaningless without a fixed false-positive rate, so every recall figure in this submission is measured at a threshold pinned to a 1% FPR on a legitimate validation split that is disjoint from every evaluation split. Where a figure is produced by a full-stack operating-point search rather than a single supervised threshold, the calibration split carries a mixed stream and the realised evaluation FPR is reported alongside the target, because a pinned budget is a design constraint rather than a guarantee. Confidence intervals are nonparametric bootstrap over seed-level means.</w:t>
       </w:r>
     </w:p>
     <w:tbl>
@@ -5747,7 +5804,7 @@
           <w:color w:val="1A1F2B"/>
           <w:sz w:val="21"/>
         </w:rPr>
-        <w:t>The three-layer stack is a working prototype, not a hardened deployment: no model-governance workflow, no challenger-model rollout, no drift alarms.</w:t>
+        <w:t>The four-layer stack is a working prototype, not a hardened deployment: no model-governance workflow, no challenger-model rollout, no drift alarms.</w:t>
       </w:r>
     </w:p>
     <w:p>
@@ -6491,7 +6548,7 @@
           <w:color w:val="5A6373"/>
           <w:sz w:val="17"/>
         </w:rPr>
-        <w:t>52061f0</w:t>
+        <w:t>e1bea35</w:t>
       </w:r>
     </w:p>
     <w:sectPr>

</xml_diff>

<commit_message>
fix(evidence): dedupe claim ledger, drop stale 8-family claim, point walkthrough at live URL
- ClaimLedger.add is now idempotent (re-runs replace a claim instead of
  appending duplicates); the coverage experiment regenerates its own claims
  rather than carrying superseded wordings forward
- removes the stale "All 8 attack families" entry and duplicate claims left
  in artifacts/claim_ledger.json
- walkthrough PROTOTYPE_URL restored to the permanent Render deployment and
  rebuilt against the calibrated family-coverage numbers
</commit_message>
<xml_diff>
--- a/docs/Solution_Walkthrough_Adversarial_Payment_Arena.docx
+++ b/docs/Solution_Walkthrough_Adversarial_Payment_Arena.docx
@@ -227,7 +227,7 @@
                 <w:color w:val="1A1F2B"/>
                 <w:sz w:val="18"/>
               </w:rPr>
-              <w:t>https://8000-i9u0fjkr9b6mijyftzlkg-8f57ffe2.sandbox.novita.ai</w:t>
+              <w:t>https://adversarial-payment-arena.onrender.com/</w:t>
             </w:r>
           </w:p>
         </w:tc>
@@ -351,7 +351,7 @@
           <w:color w:val="5A6373"/>
           <w:sz w:val="18"/>
         </w:rPr>
-        <w:t>git e1bea35 | generated 2026-08-30 15:03 UTC | seeds and commands are stamped inside every artifact.</w:t>
+        <w:t>git 6426c69 | generated 2026-08-30 15:09 UTC | seeds and commands are stamped inside every artifact.</w:t>
       </w:r>
     </w:p>
     <w:p>
@@ -6500,7 +6500,7 @@
           <w:color w:val="0B5FA5"/>
           <w:sz w:val="20"/>
         </w:rPr>
-        <w:t>https://8000-i9u0fjkr9b6mijyftzlkg-8f57ffe2.sandbox.novita.ai</w:t>
+        <w:t>https://adversarial-payment-arena.onrender.com/</w:t>
       </w:r>
     </w:p>
     <w:p>
@@ -6548,7 +6548,7 @@
           <w:color w:val="5A6373"/>
           <w:sz w:val="17"/>
         </w:rPr>
-        <w:t>e1bea35</w:t>
+        <w:t>6426c69</w:t>
       </w:r>
     </w:p>
     <w:sectPr>

</xml_diff>

<commit_message>
fix(evidence): deduplicate family coverage claim ledger entries
</commit_message>
<xml_diff>
--- a/docs/Solution_Walkthrough_Adversarial_Payment_Arena.docx
+++ b/docs/Solution_Walkthrough_Adversarial_Payment_Arena.docx
@@ -351,7 +351,7 @@
           <w:color w:val="5A6373"/>
           <w:sz w:val="18"/>
         </w:rPr>
-        <w:t>git 6426c69 | generated 2026-08-30 15:09 UTC | seeds and commands are stamped inside every artifact.</w:t>
+        <w:t>git acab85b | generated 2026-08-30 15:13 UTC | seeds and commands are stamped inside every artifact.</w:t>
       </w:r>
     </w:p>
     <w:p>
@@ -6548,7 +6548,7 @@
           <w:color w:val="5A6373"/>
           <w:sz w:val="17"/>
         </w:rPr>
-        <w:t>6426c69</w:t>
+        <w:t>acab85b</w:t>
       </w:r>
     </w:p>
     <w:sectPr>

</xml_diff>